<commit_message>
PIR-SH-001: address Gemini review — multi-leg scope, notation, bib entries
- Add multi-leg scope limitation callout to decision status: single-flight
  model does not cover valve-stuck-open on leg 2+ (Gemini C2/C3)
- Add multi-leg underpressure analysis to closure table
- Add pressure notation section: all pressures absolute unless marked gauge
- Add bib entries: FAA 14 CFR 25.841, PED 2014/68/EU, ICAO standard
  atmosphere, Swagelok 6L-CW4VR4-P datasheet (Gemini M2)
- Add cite keys to transport envelope table and valve spec table
- Include Gemini review artifact

Co-Authored-By: Claude Opus 4.6 (1M context) <noreply@anthropic.com>
</commit_message>
<xml_diff>
--- a/projects/shipping/_output/failure-mechanism.docx
+++ b/projects/shipping/_output/failure-mechanism.docx
@@ -473,7 +473,7 @@
       </w:r>
     </w:p>
     <w:bookmarkEnd w:id="9"/>
-    <w:bookmarkStart w:id="15" w:name="sec-system"/>
+    <w:bookmarkStart w:id="16" w:name="sec-system"/>
     <w:p>
       <w:pPr>
         <w:pStyle w:val="Heading1"/>
@@ -545,7 +545,21 @@
         <w:t xml:space="preserve"> </w:t>
       </w:r>
       <w:r>
-        <w:t xml:space="preserve">– a Swagelok 6L-CW4VR4-P high-purity welded check valve. It permits nitrogen to escape if the internal pressure exceeds ambient by the valve’s cracking threshold, but does not admit ambient flow inward. A separate 0.5 bar gauge safety relief valve remains on the main assembly per the European pressure equipment directive.</w:t>
+        <w:t xml:space="preserve">– a Swagelok 6L-CW4VR4-P high-purity welded check valve. It permits nitrogen to escape if the internal pressure exceeds ambient by the valve’s cracking threshold, but does not admit ambient flow inward. A separate 0.5 bar gauge safety relief valve remains on the main assembly per the European pressure equipment directive</w:t>
+      </w:r>
+      <w:r>
+        <w:t xml:space="preserve"> </w:t>
+      </w:r>
+      <w:hyperlink w:anchor="ref-ped_2014_68_eu">
+        <w:r>
+          <w:rPr>
+            <w:rStyle w:val="Hyperlink"/>
+          </w:rPr>
+          <w:t xml:space="preserve">[1]</w:t>
+        </w:r>
+      </w:hyperlink>
+      <w:r>
+        <w:t xml:space="preserve">.</w:t>
       </w:r>
     </w:p>
     <w:p>
@@ -687,6 +701,17 @@
                   <w:r>
                     <w:t xml:space="preserve">Swagelok 6L-CW4VR4-P</w:t>
                   </w:r>
+                  <w:r>
+                    <w:t xml:space="preserve"> </w:t>
+                  </w:r>
+                  <w:hyperlink w:anchor="ref-swagelok_6l_cw4vr4p">
+                    <w:r>
+                      <w:rPr>
+                        <w:rStyle w:val="Hyperlink"/>
+                      </w:rPr>
+                      <w:t xml:space="preserve">[2]</w:t>
+                    </w:r>
+                  </w:hyperlink>
                 </w:p>
               </w:tc>
             </w:tr>
@@ -931,6 +956,226 @@
         </w:tc>
       </w:tr>
     </w:tbl>
+    <w:bookmarkStart w:id="15" w:name="notation"/>
+    <w:p>
+      <w:pPr>
+        <w:pStyle w:val="Heading2"/>
+      </w:pPr>
+      <w:r>
+        <w:t xml:space="preserve">Notation</w:t>
+      </w:r>
+    </w:p>
+    <w:p>
+      <w:pPr>
+        <w:pStyle w:val="FirstParagraph"/>
+      </w:pPr>
+      <w:r>
+        <w:t xml:space="preserve">All pressures (</w:t>
+      </w:r>
+      <m:oMath>
+        <m:sSub>
+          <m:e>
+            <m:r>
+              <m:t>P</m:t>
+            </m:r>
+          </m:e>
+          <m:sub>
+            <m:r>
+              <m:t>s</m:t>
+            </m:r>
+            <m:r>
+              <m:t>e</m:t>
+            </m:r>
+            <m:r>
+              <m:t>a</m:t>
+            </m:r>
+            <m:r>
+              <m:t>l</m:t>
+            </m:r>
+          </m:sub>
+        </m:sSub>
+      </m:oMath>
+      <w:r>
+        <w:t xml:space="preserve">,</w:t>
+      </w:r>
+      <w:r>
+        <w:t xml:space="preserve"> </w:t>
+      </w:r>
+      <m:oMath>
+        <m:sSub>
+          <m:e>
+            <m:r>
+              <m:t>P</m:t>
+            </m:r>
+          </m:e>
+          <m:sub>
+            <m:r>
+              <m:t>a</m:t>
+            </m:r>
+            <m:r>
+              <m:t>m</m:t>
+            </m:r>
+            <m:r>
+              <m:t>b</m:t>
+            </m:r>
+          </m:sub>
+        </m:sSub>
+      </m:oMath>
+      <w:r>
+        <w:t xml:space="preserve">,</w:t>
+      </w:r>
+      <w:r>
+        <w:t xml:space="preserve"> </w:t>
+      </w:r>
+      <m:oMath>
+        <m:sSub>
+          <m:e>
+            <m:r>
+              <m:t>P</m:t>
+            </m:r>
+          </m:e>
+          <m:sub>
+            <m:r>
+              <m:t>l</m:t>
+            </m:r>
+            <m:r>
+              <m:t>o</m:t>
+            </m:r>
+            <m:r>
+              <m:t>w</m:t>
+            </m:r>
+          </m:sub>
+        </m:sSub>
+      </m:oMath>
+      <w:r>
+        <w:t xml:space="preserve">,</w:t>
+      </w:r>
+      <w:r>
+        <w:t xml:space="preserve"> </w:t>
+      </w:r>
+      <m:oMath>
+        <m:sSub>
+          <m:e>
+            <m:r>
+              <m:t>P</m:t>
+            </m:r>
+          </m:e>
+          <m:sub>
+            <m:r>
+              <m:t>p</m:t>
+            </m:r>
+            <m:r>
+              <m:t>e</m:t>
+            </m:r>
+            <m:r>
+              <m:t>a</m:t>
+            </m:r>
+            <m:r>
+              <m:t>k</m:t>
+            </m:r>
+          </m:sub>
+        </m:sSub>
+      </m:oMath>
+      <w:r>
+        <w:t xml:space="preserve">) are</w:t>
+      </w:r>
+      <w:r>
+        <w:t xml:space="preserve"> </w:t>
+      </w:r>
+      <w:r>
+        <w:rPr>
+          <w:b/>
+          <w:bCs/>
+        </w:rPr>
+        <w:t xml:space="preserve">absolute</w:t>
+      </w:r>
+      <w:r>
+        <w:t xml:space="preserve"> </w:t>
+      </w:r>
+      <w:r>
+        <w:t xml:space="preserve">unless explicitly marked</w:t>
+      </w:r>
+      <w:r>
+        <w:t xml:space="preserve"> </w:t>
+      </w:r>
+      <w:r>
+        <w:t xml:space="preserve">“gauge.”</w:t>
+      </w:r>
+      <w:r>
+        <w:t xml:space="preserve"> </w:t>
+      </w:r>
+      <w:r>
+        <w:t xml:space="preserve">The pressure differential</w:t>
+      </w:r>
+      <w:r>
+        <w:t xml:space="preserve"> </w:t>
+      </w:r>
+      <m:oMath>
+        <m:r>
+          <m:rPr>
+            <m:sty m:val="p"/>
+          </m:rPr>
+          <m:t>Δ</m:t>
+        </m:r>
+        <m:r>
+          <m:t>P</m:t>
+        </m:r>
+        <m:r>
+          <m:rPr>
+            <m:sty m:val="p"/>
+          </m:rPr>
+          <m:t>=</m:t>
+        </m:r>
+        <m:sSub>
+          <m:e>
+            <m:r>
+              <m:t>P</m:t>
+            </m:r>
+          </m:e>
+          <m:sub>
+            <m:r>
+              <m:t>i</m:t>
+            </m:r>
+            <m:r>
+              <m:t>n</m:t>
+            </m:r>
+            <m:r>
+              <m:t>t</m:t>
+            </m:r>
+          </m:sub>
+        </m:sSub>
+        <m:r>
+          <m:rPr>
+            <m:sty m:val="p"/>
+          </m:rPr>
+          <m:t>−</m:t>
+        </m:r>
+        <m:sSub>
+          <m:e>
+            <m:r>
+              <m:t>P</m:t>
+            </m:r>
+          </m:e>
+          <m:sub>
+            <m:r>
+              <m:t>a</m:t>
+            </m:r>
+            <m:r>
+              <m:t>m</m:t>
+            </m:r>
+            <m:r>
+              <m:t>b</m:t>
+            </m:r>
+          </m:sub>
+        </m:sSub>
+      </m:oMath>
+      <w:r>
+        <w:t xml:space="preserve"> </w:t>
+      </w:r>
+      <w:r>
+        <w:t xml:space="preserve">is always gauge (positive when internal exceeds ambient). Cracking pressures and relief setpoints are stated in gauge units (psig or bar gauge). Volumes are in litres, temperatures in kelvin for equations and degrees Celsius in narrative.</w:t>
+      </w:r>
+    </w:p>
     <w:p>
       <w:pPr>
         <w:pStyle w:val="BodyText"/>
@@ -1215,7 +1460,8 @@
       </w:tr>
     </w:tbl>
     <w:bookmarkEnd w:id="15"/>
-    <w:bookmarkStart w:id="21" w:name="sec-envelope"/>
+    <w:bookmarkEnd w:id="16"/>
+    <w:bookmarkStart w:id="22" w:name="sec-envelope"/>
     <w:p>
       <w:pPr>
         <w:pStyle w:val="Heading1"/>
@@ -1256,7 +1502,7 @@
       <w:tr>
         <w:tc>
           <w:tcPr/>
-          <w:bookmarkStart w:id="16" w:name="tbl-shipping-spec"/>
+          <w:bookmarkStart w:id="17" w:name="tbl-shipping-spec"/>
           <w:p>
             <w:pPr>
               <w:jc w:val="center"/>
@@ -1450,7 +1696,7 @@
               </w:tc>
             </w:tr>
           </w:tbl>
-          <w:bookmarkEnd w:id="16"/>
+          <w:bookmarkEnd w:id="17"/>
           <w:p/>
         </w:tc>
       </w:tr>
@@ -1490,7 +1736,7 @@
       <w:tr>
         <w:tc>
           <w:tcPr/>
-          <w:bookmarkStart w:id="17" w:name="tbl-transport-envelope"/>
+          <w:bookmarkStart w:id="18" w:name="tbl-transport-envelope"/>
           <w:p>
             <w:pPr>
               <w:jc w:val="center"/>
@@ -1685,6 +1931,17 @@
                   <w:r>
                     <w:t xml:space="preserve">FAA 14 CFR 25.841</w:t>
                   </w:r>
+                  <w:r>
+                    <w:t xml:space="preserve"> </w:t>
+                  </w:r>
+                  <w:hyperlink w:anchor="ref-faa_14cfr25_841">
+                    <w:r>
+                      <w:rPr>
+                        <w:rStyle w:val="Hyperlink"/>
+                      </w:rPr>
+                      <w:t xml:space="preserve">[3]</w:t>
+                    </w:r>
+                  </w:hyperlink>
                 </w:p>
               </w:tc>
             </w:tr>
@@ -1726,6 +1983,17 @@
                   <w:r>
                     <w:t xml:space="preserve">ICAO standard atmosphere at 8000 ft</w:t>
                   </w:r>
+                  <w:r>
+                    <w:t xml:space="preserve"> </w:t>
+                  </w:r>
+                  <w:hyperlink w:anchor="ref-icao_std_atmosphere">
+                    <w:r>
+                      <w:rPr>
+                        <w:rStyle w:val="Hyperlink"/>
+                      </w:rPr>
+                      <w:t xml:space="preserve">[4]</w:t>
+                    </w:r>
+                  </w:hyperlink>
                 </w:p>
               </w:tc>
             </w:tr>
@@ -2034,7 +2302,7 @@
               </w:tc>
             </w:tr>
           </w:tbl>
-          <w:bookmarkEnd w:id="17"/>
+          <w:bookmarkEnd w:id="18"/>
           <w:p/>
         </w:tc>
       </w:tr>
@@ -2088,18 +2356,18 @@
                 <wp:inline>
                   <wp:extent cx="152400" cy="152400"/>
                   <wp:effectExtent b="0" l="0" r="0" t="0"/>
-                  <wp:docPr descr="" title="" id="19" name="Picture"/>
+                  <wp:docPr descr="" title="" id="20" name="Picture"/>
                   <a:graphic>
                     <a:graphicData uri="http://schemas.openxmlformats.org/drawingml/2006/picture">
                       <pic:pic>
                         <pic:nvPicPr>
-                          <pic:cNvPr descr="C:\Program Files\Quarto\share\formats\docx\note.png" id="20" name="Picture"/>
+                          <pic:cNvPr descr="C:\Program Files\Quarto\share\formats\docx\note.png" id="21" name="Picture"/>
                           <pic:cNvPicPr>
                             <a:picLocks noChangeArrowheads="1" noChangeAspect="1"/>
                           </pic:cNvPicPr>
                         </pic:nvPicPr>
                         <pic:blipFill>
-                          <a:blip r:embed="rId18"/>
+                          <a:blip r:embed="rId19"/>
                           <a:stretch>
                             <a:fillRect/>
                           </a:stretch>
@@ -2457,8 +2725,8 @@
         <w:t xml:space="preserve">sub-atmospheric internal condition as a failure, on the basis that the duration of the shipping cycle is long enough to convert any quasi-static pressure deficit into a measurable contamination event.</w:t>
       </w:r>
     </w:p>
-    <w:bookmarkEnd w:id="21"/>
-    <w:bookmarkStart w:id="25" w:name="sec-field-history"/>
+    <w:bookmarkEnd w:id="22"/>
+    <w:bookmarkStart w:id="26" w:name="sec-field-history"/>
     <w:p>
       <w:pPr>
         <w:pStyle w:val="Heading1"/>
@@ -2508,18 +2776,18 @@
                 <wp:inline>
                   <wp:extent cx="152400" cy="152400"/>
                   <wp:effectExtent b="0" l="0" r="0" t="0"/>
-                  <wp:docPr descr="" title="" id="23" name="Picture"/>
+                  <wp:docPr descr="" title="" id="24" name="Picture"/>
                   <a:graphic>
                     <a:graphicData uri="http://schemas.openxmlformats.org/drawingml/2006/picture">
                       <pic:pic>
                         <pic:nvPicPr>
-                          <pic:cNvPr descr="C:\Program Files\Quarto\share\formats\docx\important.png" id="24" name="Picture"/>
+                          <pic:cNvPr descr="C:\Program Files\Quarto\share\formats\docx\important.png" id="25" name="Picture"/>
                           <pic:cNvPicPr>
                             <a:picLocks noChangeArrowheads="1" noChangeAspect="1"/>
                           </pic:cNvPicPr>
                         </pic:nvPicPr>
                         <pic:blipFill>
-                          <a:blip r:embed="rId22"/>
+                          <a:blip r:embed="rId23"/>
                           <a:stretch>
                             <a:fillRect/>
                           </a:stretch>
@@ -2666,8 +2934,8 @@
         <w:t xml:space="preserve">to atmospheric ingress under sub-atmospheric internal conditions; this is not a hypothetical concern. Second, the failure manifests over a shipping duration measured in weeks, which is consistent with quasi-static thermodynamics rather than transient dynamic overpressure. Both facts point the analysis toward the low-pressure side of the transport cycle.</w:t>
       </w:r>
     </w:p>
-    <w:bookmarkEnd w:id="25"/>
-    <w:bookmarkStart w:id="28" w:name="sec-high-pressure-review"/>
+    <w:bookmarkEnd w:id="26"/>
+    <w:bookmarkStart w:id="29" w:name="sec-high-pressure-review"/>
     <w:p>
       <w:pPr>
         <w:pStyle w:val="Heading1"/>
@@ -2750,18 +3018,18 @@
                 <wp:inline>
                   <wp:extent cx="152400" cy="152400"/>
                   <wp:effectExtent b="0" l="0" r="0" t="0"/>
-                  <wp:docPr descr="" title="" id="26" name="Picture"/>
+                  <wp:docPr descr="" title="" id="27" name="Picture"/>
                   <a:graphic>
                     <a:graphicData uri="http://schemas.openxmlformats.org/drawingml/2006/picture">
                       <pic:pic>
                         <pic:nvPicPr>
-                          <pic:cNvPr descr="C:\Program Files\Quarto\share\formats\docx\note.png" id="27" name="Picture"/>
+                          <pic:cNvPr descr="C:\Program Files\Quarto\share\formats\docx\note.png" id="28" name="Picture"/>
                           <pic:cNvPicPr>
                             <a:picLocks noChangeArrowheads="1" noChangeAspect="1"/>
                           </pic:cNvPicPr>
                         </pic:nvPicPr>
                         <pic:blipFill>
-                          <a:blip r:embed="rId18"/>
+                          <a:blip r:embed="rId19"/>
                           <a:stretch>
                             <a:fillRect/>
                           </a:stretch>
@@ -2825,8 +3093,8 @@
         </w:tc>
       </w:tr>
     </w:tbl>
-    <w:bookmarkEnd w:id="28"/>
-    <w:bookmarkStart w:id="39" w:name="sec-actual-mechanism"/>
+    <w:bookmarkEnd w:id="29"/>
+    <w:bookmarkStart w:id="40" w:name="sec-actual-mechanism"/>
     <w:p>
       <w:pPr>
         <w:pStyle w:val="Heading1"/>
@@ -2877,7 +3145,7 @@
         <w:t xml:space="preserve">shows the failure sequence that emerges when the rigid volume exceeds the nonnegative-return threshold or the vent cracking pressure is low enough to permit outbound venting.</w:t>
       </w:r>
     </w:p>
-    <w:bookmarkStart w:id="29" w:name="regime-1-bag-absorbs-expansion"/>
+    <w:bookmarkStart w:id="30" w:name="regime-1-bag-absorbs-expansion"/>
     <w:p>
       <w:pPr>
         <w:pStyle w:val="Heading2"/>
@@ -2894,8 +3162,8 @@
         <w:t xml:space="preserve">During ascent and heating, the nitrogen attempts to expand. As long as the bag has remaining headroom, the bag unfolds and the internal pressure tracks ambient pressure. No harmful differential pressure develops in this regime.</w:t>
       </w:r>
     </w:p>
-    <w:bookmarkEnd w:id="29"/>
-    <w:bookmarkStart w:id="30" w:name="X758403d1fe513fc7041bf236e73558b6ad910ec"/>
+    <w:bookmarkEnd w:id="30"/>
+    <w:bookmarkStart w:id="31" w:name="X758403d1fe513fc7041bf236e73558b6ad910ec"/>
     <w:p>
       <w:pPr>
         <w:pStyle w:val="Heading2"/>
@@ -2912,8 +3180,8 @@
         <w:t xml:space="preserve">Once the bag reaches maximum volume, the system has no remaining geometric compliance. Continued expansion appears as pressure rise. If the outward-only valve opens, nitrogen leaves the system. This is the irreversible step in the cycle. The system now contains less nitrogen than it does at seal-up.</w:t>
       </w:r>
     </w:p>
-    <w:bookmarkEnd w:id="30"/>
-    <w:bookmarkStart w:id="38" w:name="X003cca25642a2f30c7eb556c359d76b57e1d9f4"/>
+    <w:bookmarkEnd w:id="31"/>
+    <w:bookmarkStart w:id="39" w:name="X003cca25642a2f30c7eb556c359d76b57e1d9f4"/>
     <w:p>
       <w:pPr>
         <w:pStyle w:val="Heading2"/>
@@ -2930,7 +3198,7 @@
         <w:t xml:space="preserve">During descent and cooling, ambient pressure rises and gas temperature falls. The bag collapses. If the bag reaches zero volume before the remaining nitrogen inventory can support ambient pressure in the rigid connected volume, internal pressure falls below ambient. Once that happens, the seal network becomes an inward leakage path and ambient contamination is thermodynamically favored.</w:t>
       </w:r>
     </w:p>
-    <w:bookmarkStart w:id="37" w:name="fig-ideal-vent-cycle"/>
+    <w:bookmarkStart w:id="38" w:name="fig-ideal-vent-cycle"/>
     <w:tbl>
       <w:tblPr>
         <w:tblStyle w:val="Table"/>
@@ -2954,18 +3222,18 @@
                 <wp:inline>
                   <wp:extent cx="2971800" cy="2566302"/>
                   <wp:effectExtent b="0" l="0" r="0" t="0"/>
-                  <wp:docPr descr="" title="" id="32" name="Picture"/>
+                  <wp:docPr descr="" title="" id="33" name="Picture"/>
                   <a:graphic>
                     <a:graphicData uri="http://schemas.openxmlformats.org/drawingml/2006/picture">
                       <pic:pic>
                         <pic:nvPicPr>
-                          <pic:cNvPr descr="generated/PIR-SH-001_quasistatic_pressure_examples_ideal_vent.png" id="33" name="Picture"/>
+                          <pic:cNvPr descr="generated/PIR-SH-001_quasistatic_pressure_examples_ideal_vent.png" id="34" name="Picture"/>
                           <pic:cNvPicPr>
                             <a:picLocks noChangeArrowheads="1" noChangeAspect="1"/>
                           </pic:cNvPicPr>
                         </pic:nvPicPr>
                         <pic:blipFill>
-                          <a:blip r:embed="rId31"/>
+                          <a:blip r:embed="rId32"/>
                           <a:stretch>
                             <a:fillRect/>
                           </a:stretch>
@@ -3004,18 +3272,18 @@
                 <wp:inline>
                   <wp:extent cx="2971800" cy="2595409"/>
                   <wp:effectExtent b="0" l="0" r="0" t="0"/>
-                  <wp:docPr descr="" title="" id="35" name="Picture"/>
+                  <wp:docPr descr="" title="" id="36" name="Picture"/>
                   <a:graphic>
                     <a:graphicData uri="http://schemas.openxmlformats.org/drawingml/2006/picture">
                       <pic:pic>
                         <pic:nvPicPr>
-                          <pic:cNvPr descr="generated/PIR-SH-001_quasistatic_bag_examples_ideal_vent.png" id="36" name="Picture"/>
+                          <pic:cNvPr descr="generated/PIR-SH-001_quasistatic_bag_examples_ideal_vent.png" id="37" name="Picture"/>
                           <pic:cNvPicPr>
                             <a:picLocks noChangeArrowheads="1" noChangeAspect="1"/>
                           </pic:cNvPicPr>
                         </pic:nvPicPr>
                         <pic:blipFill>
-                          <a:blip r:embed="rId34"/>
+                          <a:blip r:embed="rId35"/>
                           <a:stretch>
                             <a:fillRect/>
                           </a:stretch>
@@ -3105,10 +3373,10 @@
         <w:t xml:space="preserve">). The failing 60 L case shows the full three-regime sequence: bag saturation, irreversible venting, then return-leg collapse and underpressure.</w:t>
       </w:r>
     </w:p>
-    <w:bookmarkEnd w:id="37"/>
     <w:bookmarkEnd w:id="38"/>
     <w:bookmarkEnd w:id="39"/>
-    <w:bookmarkStart w:id="40" w:name="sec-model"/>
+    <w:bookmarkEnd w:id="40"/>
+    <w:bookmarkStart w:id="41" w:name="sec-model"/>
     <w:p>
       <w:pPr>
         <w:pStyle w:val="Heading1"/>
@@ -5227,8 +5495,8 @@
         <w:t xml:space="preserve">This model is intentionally simple. It omits bag leakage, valve hysteresis, and transient fluid dynamics. That simplicity strengthens the root-cause argument: if the mechanism appears under these idealized assumptions, then bag leakage is not required to explain the observed failures.</w:t>
       </w:r>
     </w:p>
-    <w:bookmarkEnd w:id="40"/>
-    <w:bookmarkStart w:id="46" w:name="sec-thresholds"/>
+    <w:bookmarkEnd w:id="41"/>
+    <w:bookmarkStart w:id="47" w:name="sec-thresholds"/>
     <w:p>
       <w:pPr>
         <w:pStyle w:val="Heading1"/>
@@ -5245,7 +5513,7 @@
         <w:t xml:space="preserve">The piecewise model yields two closed-form screening expressions that determine whether the concept can work at all.</w:t>
       </w:r>
     </w:p>
-    <w:bookmarkStart w:id="42" w:name="X2575dec5d7a2c1559a3fcfd0105e97a9e6739f9"/>
+    <w:bookmarkStart w:id="43" w:name="X2575dec5d7a2c1559a3fcfd0105e97a9e6739f9"/>
     <w:p>
       <w:pPr>
         <w:pStyle w:val="Heading2"/>
@@ -5776,7 +6044,7 @@
       <w:pPr>
         <w:pStyle w:val="BodyText"/>
       </w:pPr>
-      <w:bookmarkStart w:id="41" w:name="eq-no-vent"/>
+      <w:bookmarkStart w:id="42" w:name="eq-no-vent"/>
       <m:oMathPara>
         <m:oMathParaPr>
           <m:jc m:val="center"/>
@@ -5937,7 +6205,7 @@
           </m:r>
         </m:oMath>
       </m:oMathPara>
-      <w:bookmarkEnd w:id="41"/>
+      <w:bookmarkEnd w:id="42"/>
     </w:p>
     <w:p>
       <w:pPr>
@@ -6185,8 +6453,8 @@
         <w:t xml:space="preserve">must vent on the outbound leg under the ideal-vent assumption.</w:t>
       </w:r>
     </w:p>
-    <w:bookmarkEnd w:id="42"/>
-    <w:bookmarkStart w:id="45" w:name="X00bd9b3953d658b6efe324ea496f5ab79af9d75"/>
+    <w:bookmarkEnd w:id="43"/>
+    <w:bookmarkStart w:id="46" w:name="X00bd9b3953d658b6efe324ea496f5ab79af9d75"/>
     <w:p>
       <w:pPr>
         <w:pStyle w:val="Heading2"/>
@@ -7017,7 +7285,7 @@
       <w:pPr>
         <w:pStyle w:val="BodyText"/>
       </w:pPr>
-      <w:bookmarkStart w:id="43" w:name="eq-return-threshold"/>
+      <w:bookmarkStart w:id="44" w:name="eq-return-threshold"/>
       <m:oMathPara>
         <m:oMathParaPr>
           <m:jc m:val="center"/>
@@ -7169,7 +7437,7 @@
           </m:r>
         </m:oMath>
       </m:oMathPara>
-      <w:bookmarkEnd w:id="43"/>
+      <w:bookmarkEnd w:id="44"/>
     </w:p>
     <w:p>
       <w:pPr>
@@ -7428,7 +7696,7 @@
       <w:tr>
         <w:tc>
           <w:tcPr/>
-          <w:bookmarkStart w:id="44" w:name="tbl-thresholds"/>
+          <w:bookmarkStart w:id="45" w:name="tbl-thresholds"/>
           <w:p>
             <w:pPr>
               <w:jc w:val="center"/>
@@ -7751,7 +8019,7 @@
               </w:tc>
             </w:tr>
           </w:tbl>
-          <w:bookmarkEnd w:id="44"/>
+          <w:bookmarkEnd w:id="45"/>
           <w:p/>
         </w:tc>
       </w:tr>
@@ -7775,9 +8043,9 @@
         <w:t xml:space="preserve">shows that increasing the outward vent threshold delays mass loss and increases the return-leg threshold, but it does not remove the mechanism. The failure remains a mass-inventory problem. A higher vent threshold merely shifts the volume at which the same mechanism appears.</w:t>
       </w:r>
     </w:p>
-    <w:bookmarkEnd w:id="45"/>
     <w:bookmarkEnd w:id="46"/>
-    <w:bookmarkStart w:id="58" w:name="sec-results"/>
+    <w:bookmarkEnd w:id="47"/>
+    <w:bookmarkStart w:id="59" w:name="sec-results"/>
     <w:p>
       <w:pPr>
         <w:pStyle w:val="Heading1"/>
@@ -7850,7 +8118,7 @@
       <w:tr>
         <w:tc>
           <w:tcPr/>
-          <w:bookmarkStart w:id="50" w:name="fig-min-dp-sweep"/>
+          <w:bookmarkStart w:id="51" w:name="fig-min-dp-sweep"/>
           <w:p>
             <w:pPr>
               <w:pStyle w:val="Compact"/>
@@ -7861,18 +8129,18 @@
                 <wp:inline>
                   <wp:extent cx="5334000" cy="3677572"/>
                   <wp:effectExtent b="0" l="0" r="0" t="0"/>
-                  <wp:docPr descr="" title="" id="48" name="Picture"/>
+                  <wp:docPr descr="" title="" id="49" name="Picture"/>
                   <a:graphic>
                     <a:graphicData uri="http://schemas.openxmlformats.org/drawingml/2006/picture">
                       <pic:pic>
                         <pic:nvPicPr>
-                          <pic:cNvPr descr="generated/PIR-SH-001_quasistatic_min_dp_sweep.png" id="49" name="Picture"/>
+                          <pic:cNvPr descr="generated/PIR-SH-001_quasistatic_min_dp_sweep.png" id="50" name="Picture"/>
                           <pic:cNvPicPr>
                             <a:picLocks noChangeArrowheads="1" noChangeAspect="1"/>
                           </pic:cNvPicPr>
                         </pic:nvPicPr>
                         <pic:blipFill>
-                          <a:blip r:embed="rId47"/>
+                          <a:blip r:embed="rId48"/>
                           <a:stretch>
                             <a:fillRect/>
                           </a:stretch>
@@ -7912,7 +8180,7 @@
               <w:t xml:space="preserve">Figure 3: Minimum internal-minus-ambient pressure versus rigid connected volume for the two vent assumptions evaluated in the MATLAB model. The ideal-vent case crosses below zero at 50.21 L, and the 2 psig case shifts that crossing to 102.11 L.</w:t>
             </w:r>
           </w:p>
-          <w:bookmarkEnd w:id="50"/>
+          <w:bookmarkEnd w:id="51"/>
         </w:tc>
       </w:tr>
     </w:tbl>
@@ -7937,7 +8205,7 @@
       <w:tr>
         <w:tc>
           <w:tcPr/>
-          <w:bookmarkStart w:id="51" w:name="tbl-cases"/>
+          <w:bookmarkStart w:id="52" w:name="tbl-cases"/>
           <w:p>
             <w:pPr>
               <w:jc w:val="center"/>
@@ -9056,7 +9324,7 @@
               </w:tc>
             </w:tr>
           </w:tbl>
-          <w:bookmarkEnd w:id="51"/>
+          <w:bookmarkEnd w:id="52"/>
           <w:p/>
         </w:tc>
       </w:tr>
@@ -9099,7 +9367,7 @@
         <w:t xml:space="preserve">Second, the 60 L ideal-vent case produces the exact sequence implicated by the field failures. The bag fills early, the valve vents nitrogen, the bag later collapses, and the minimum pressure differential reaches -0.0371 bar. At that point the contamination driver is present even though the model assumes a perfect outward-only valve.</w:t>
       </w:r>
     </w:p>
-    <w:bookmarkStart w:id="57" w:name="sec-bag-sensitivity"/>
+    <w:bookmarkStart w:id="58" w:name="sec-bag-sensitivity"/>
     <w:p>
       <w:pPr>
         <w:pStyle w:val="Heading2"/>
@@ -9248,7 +9516,7 @@
       <w:tr>
         <w:tc>
           <w:tcPr/>
-          <w:bookmarkStart w:id="52" w:name="tbl-bag-sweep"/>
+          <w:bookmarkStart w:id="53" w:name="tbl-bag-sweep"/>
           <w:p>
             <w:pPr>
               <w:jc w:val="center"/>
@@ -13542,7 +13810,7 @@
               </w:tc>
             </w:tr>
           </w:tbl>
-          <w:bookmarkEnd w:id="52"/>
+          <w:bookmarkEnd w:id="53"/>
           <w:p/>
         </w:tc>
       </w:tr>
@@ -13820,7 +14088,7 @@
       <w:tr>
         <w:tc>
           <w:tcPr/>
-          <w:bookmarkStart w:id="56" w:name="fig-bag-sensitivity"/>
+          <w:bookmarkStart w:id="57" w:name="fig-bag-sensitivity"/>
           <w:p>
             <w:pPr>
               <w:pStyle w:val="Compact"/>
@@ -13831,18 +14099,18 @@
                 <wp:inline>
                   <wp:extent cx="5334000" cy="3510555"/>
                   <wp:effectExtent b="0" l="0" r="0" t="0"/>
-                  <wp:docPr descr="" title="" id="54" name="Picture"/>
+                  <wp:docPr descr="" title="" id="55" name="Picture"/>
                   <a:graphic>
                     <a:graphicData uri="http://schemas.openxmlformats.org/drawingml/2006/picture">
                       <pic:pic>
                         <pic:nvPicPr>
-                          <pic:cNvPr descr="failure-mechanism_files/figure-docx/fig-bag-sensitivity-output-1.png" id="55" name="Picture"/>
+                          <pic:cNvPr descr="failure-mechanism_files/figure-docx/fig-bag-sensitivity-output-1.png" id="56" name="Picture"/>
                           <pic:cNvPicPr>
                             <a:picLocks noChangeArrowheads="1" noChangeAspect="1"/>
                           </pic:cNvPicPr>
                         </pic:nvPicPr>
                         <pic:blipFill>
-                          <a:blip r:embed="rId53"/>
+                          <a:blip r:embed="rId54"/>
                           <a:stretch>
                             <a:fillRect/>
                           </a:stretch>
@@ -13882,13 +14150,13 @@
               <w:t xml:space="preserve">Figure 4: Minimum return-leg pressure differential versus bag volume and initial fill for V_fixed = 35 L with an ideal vent (P_crack = 0). The heavy contour marks ΔP = 0 (the failure boundary). Below approximately 13 L bag capacity, the system goes sub-atmospheric on the return leg regardless of initial fill. Above 13 L, the return leg remains nonnegative even though venting may still occur at higher fill levels. The 2 psig valve case (not shown) is safe everywhere in this parameter space.</w:t>
             </w:r>
           </w:p>
-          <w:bookmarkEnd w:id="56"/>
+          <w:bookmarkEnd w:id="57"/>
         </w:tc>
       </w:tr>
     </w:tbl>
-    <w:bookmarkEnd w:id="57"/>
     <w:bookmarkEnd w:id="58"/>
-    <w:bookmarkStart w:id="82" w:name="sec-upper-bound"/>
+    <w:bookmarkEnd w:id="59"/>
+    <w:bookmarkStart w:id="83" w:name="sec-upper-bound"/>
     <w:p>
       <w:pPr>
         <w:pStyle w:val="Heading1"/>
@@ -13913,7 +14181,7 @@
         <w:t xml:space="preserve">This section derives an analytical upper bound on the maximum internal overpressure that can develop during any single-flight shipping cycle, then verifies the bound against the full Helmholtz equation of state for nitrogen via CoolProp.</w:t>
       </w:r>
     </w:p>
-    <w:bookmarkStart w:id="66" w:name="sec-overpressure-bound"/>
+    <w:bookmarkStart w:id="67" w:name="sec-overpressure-bound"/>
     <w:p>
       <w:pPr>
         <w:pStyle w:val="Heading2"/>
@@ -14040,7 +14308,7 @@
       <w:pPr>
         <w:pStyle w:val="BodyText"/>
       </w:pPr>
-      <w:bookmarkStart w:id="59" w:name="eq-pint-bound"/>
+      <w:bookmarkStart w:id="60" w:name="eq-pint-bound"/>
       <m:oMathPara>
         <m:oMathParaPr>
           <m:jc m:val="center"/>
@@ -14150,7 +14418,7 @@
           </m:r>
         </m:oMath>
       </m:oMathPara>
-      <w:bookmarkEnd w:id="59"/>
+      <w:bookmarkEnd w:id="60"/>
     </w:p>
     <w:p>
       <w:pPr>
@@ -14178,7 +14446,7 @@
       <w:pPr>
         <w:pStyle w:val="BodyText"/>
       </w:pPr>
-      <w:bookmarkStart w:id="60" w:name="eq-dp-bound"/>
+      <w:bookmarkStart w:id="61" w:name="eq-dp-bound"/>
       <m:oMathPara>
         <m:oMathParaPr>
           <m:jc m:val="center"/>
@@ -14309,7 +14577,7 @@
           </m:r>
         </m:oMath>
       </m:oMathPara>
-      <w:bookmarkEnd w:id="60"/>
+      <w:bookmarkEnd w:id="61"/>
     </w:p>
     <w:p>
       <w:pPr>
@@ -14362,7 +14630,7 @@
         <w:t xml:space="preserve">is lowest – the cruise-altitude condition.</w:t>
       </w:r>
     </w:p>
-    <w:bookmarkStart w:id="63" w:name="sec-cruise-bound"/>
+    <w:bookmarkStart w:id="64" w:name="sec-cruise-bound"/>
     <w:p>
       <w:pPr>
         <w:pStyle w:val="Heading3"/>
@@ -14457,7 +14725,7 @@
       <w:tr>
         <w:tc>
           <w:tcPr/>
-          <w:bookmarkStart w:id="61" w:name="tbl-cruise-overpressure"/>
+          <w:bookmarkStart w:id="62" w:name="tbl-cruise-overpressure"/>
           <w:p>
             <w:pPr>
               <w:jc w:val="center"/>
@@ -14883,7 +15151,7 @@
               </w:tc>
             </w:tr>
           </w:tbl>
-          <w:bookmarkEnd w:id="61"/>
+          <w:bookmarkEnd w:id="62"/>
           <w:p/>
         </w:tc>
       </w:tr>
@@ -14908,7 +15176,7 @@
       <w:pPr>
         <w:pStyle w:val="BodyText"/>
       </w:pPr>
-      <w:bookmarkStart w:id="62" w:name="eq-t-relief"/>
+      <w:bookmarkStart w:id="63" w:name="eq-t-relief"/>
       <m:oMathPara>
         <m:oMathParaPr>
           <m:jc m:val="center"/>
@@ -15167,7 +15435,7 @@
           </m:r>
         </m:oMath>
       </m:oMathPara>
-      <w:bookmarkEnd w:id="62"/>
+      <w:bookmarkEnd w:id="63"/>
     </w:p>
     <w:p>
       <w:pPr>
@@ -15209,8 +15477,8 @@
         <w:t xml:space="preserve">.</w:t>
       </w:r>
     </w:p>
-    <w:bookmarkEnd w:id="63"/>
-    <w:bookmarkStart w:id="65" w:name="sec-tarmac-bound"/>
+    <w:bookmarkEnd w:id="64"/>
+    <w:bookmarkStart w:id="66" w:name="sec-tarmac-bound"/>
     <w:p>
       <w:pPr>
         <w:pStyle w:val="Heading3"/>
@@ -15416,7 +15684,7 @@
       <w:tr>
         <w:tc>
           <w:tcPr/>
-          <w:bookmarkStart w:id="64" w:name="tbl-tarmac-overpressure"/>
+          <w:bookmarkStart w:id="65" w:name="tbl-tarmac-overpressure"/>
           <w:p>
             <w:pPr>
               <w:jc w:val="center"/>
@@ -15711,7 +15979,7 @@
               </w:tc>
             </w:tr>
           </w:tbl>
-          <w:bookmarkEnd w:id="64"/>
+          <w:bookmarkEnd w:id="65"/>
           <w:p/>
         </w:tc>
       </w:tr>
@@ -15724,9 +15992,9 @@
         <w:t xml:space="preserve">At 80 °C tarmac temperature – an extreme that exceeds any realistic cargo hold condition – the overpressure reaches 0.21 bar gauge, still less than half the relief threshold.</w:t>
       </w:r>
     </w:p>
-    <w:bookmarkEnd w:id="65"/>
     <w:bookmarkEnd w:id="66"/>
-    <w:bookmarkStart w:id="68" w:name="sec-coolprop-verify"/>
+    <w:bookmarkEnd w:id="67"/>
+    <w:bookmarkStart w:id="69" w:name="sec-coolprop-verify"/>
     <w:p>
       <w:pPr>
         <w:pStyle w:val="Heading2"/>
@@ -17004,7 +17272,7 @@
       <w:tr>
         <w:tc>
           <w:tcPr/>
-          <w:bookmarkStart w:id="67" w:name="tbl-coolprop-verification"/>
+          <w:bookmarkStart w:id="68" w:name="tbl-coolprop-verification"/>
           <w:p>
             <w:pPr>
               <w:jc w:val="center"/>
@@ -17677,7 +17945,7 @@
               </w:tc>
             </w:tr>
           </w:tbl>
-          <w:bookmarkEnd w:id="67"/>
+          <w:bookmarkEnd w:id="68"/>
           <w:p/>
         </w:tc>
       </w:tr>
@@ -17707,8 +17975,8 @@
         <w:t xml:space="preserve">is therefore conservative to within negligible error.</w:t>
       </w:r>
     </w:p>
-    <w:bookmarkEnd w:id="68"/>
-    <w:bookmarkStart w:id="80" w:name="sec-parametric-surface"/>
+    <w:bookmarkEnd w:id="69"/>
+    <w:bookmarkStart w:id="81" w:name="sec-parametric-surface"/>
     <w:p>
       <w:pPr>
         <w:pStyle w:val="Heading2"/>
@@ -17863,7 +18131,7 @@
       <w:tr>
         <w:tc>
           <w:tcPr/>
-          <w:bookmarkStart w:id="72" w:name="fig-failure-boundary"/>
+          <w:bookmarkStart w:id="73" w:name="fig-failure-boundary"/>
           <w:p>
             <w:pPr>
               <w:pStyle w:val="Compact"/>
@@ -17874,18 +18142,18 @@
                 <wp:inline>
                   <wp:extent cx="5334000" cy="3447448"/>
                   <wp:effectExtent b="0" l="0" r="0" t="0"/>
-                  <wp:docPr descr="" title="" id="70" name="Picture"/>
+                  <wp:docPr descr="" title="" id="71" name="Picture"/>
                   <a:graphic>
                     <a:graphicData uri="http://schemas.openxmlformats.org/drawingml/2006/picture">
                       <pic:pic>
                         <pic:nvPicPr>
-                          <pic:cNvPr descr="failure-mechanism_files/figure-docx/fig-failure-boundary-output-1.png" id="71" name="Picture"/>
+                          <pic:cNvPr descr="failure-mechanism_files/figure-docx/fig-failure-boundary-output-1.png" id="72" name="Picture"/>
                           <pic:cNvPicPr>
                             <a:picLocks noChangeArrowheads="1" noChangeAspect="1"/>
                           </pic:cNvPicPr>
                         </pic:nvPicPr>
                         <pic:blipFill>
-                          <a:blip r:embed="rId69"/>
+                          <a:blip r:embed="rId70"/>
                           <a:stretch>
                             <a:fillRect/>
                           </a:stretch>
@@ -17925,7 +18193,7 @@
               <w:t xml:space="preserve">Figure 5: Failure boundary (ΔP = 0 contour) on the (V_fixed, T_cargo) plane for five cracking-pressure values. Below each contour the system returns with nonnegative pressure. The 0.5 bar circuit relief boundary (heavy line) lies above the plotted temperature range — the system is safe everywhere in the physically realizable operating envelope.</w:t>
             </w:r>
           </w:p>
-          <w:bookmarkEnd w:id="72"/>
+          <w:bookmarkEnd w:id="73"/>
         </w:tc>
       </w:tr>
     </w:tbl>
@@ -18076,7 +18344,7 @@
       <w:tr>
         <w:tc>
           <w:tcPr/>
-          <w:bookmarkStart w:id="76" w:name="fig-dp-surface"/>
+          <w:bookmarkStart w:id="77" w:name="fig-dp-surface"/>
           <w:p>
             <w:pPr>
               <w:pStyle w:val="Compact"/>
@@ -18087,18 +18355,18 @@
                 <wp:inline>
                   <wp:extent cx="5334000" cy="2219286"/>
                   <wp:effectExtent b="0" l="0" r="0" t="0"/>
-                  <wp:docPr descr="" title="" id="74" name="Picture"/>
+                  <wp:docPr descr="" title="" id="75" name="Picture"/>
                   <a:graphic>
                     <a:graphicData uri="http://schemas.openxmlformats.org/drawingml/2006/picture">
                       <pic:pic>
                         <pic:nvPicPr>
-                          <pic:cNvPr descr="failure-mechanism_files/figure-docx/fig-dp-surface-output-1.png" id="75" name="Picture"/>
+                          <pic:cNvPr descr="failure-mechanism_files/figure-docx/fig-dp-surface-output-1.png" id="76" name="Picture"/>
                           <pic:cNvPicPr>
                             <a:picLocks noChangeArrowheads="1" noChangeAspect="1"/>
                           </pic:cNvPicPr>
                         </pic:nvPicPr>
                         <pic:blipFill>
-                          <a:blip r:embed="rId73"/>
+                          <a:blip r:embed="rId74"/>
                           <a:stretch>
                             <a:fillRect/>
                           </a:stretch>
@@ -18138,7 +18406,7 @@
               <w:t xml:space="preserve">Figure 6: Worst return-leg pressure deficit for the ideal-vent case (P_crack = 0). Left: filled contour map with the ΔP = 0 boundary (black line) separating the safe region (green, ΔP &gt;= 0) from the failure region (red, ΔP &lt; 0). Right: 3D surface showing the steep transition at the failure boundary.</w:t>
             </w:r>
           </w:p>
-          <w:bookmarkEnd w:id="76"/>
+          <w:bookmarkEnd w:id="77"/>
         </w:tc>
       </w:tr>
     </w:tbl>
@@ -18275,18 +18543,18 @@
                 <wp:inline>
                   <wp:extent cx="152400" cy="152400"/>
                   <wp:effectExtent b="0" l="0" r="0" t="0"/>
-                  <wp:docPr descr="" title="" id="77" name="Picture"/>
+                  <wp:docPr descr="" title="" id="78" name="Picture"/>
                   <a:graphic>
                     <a:graphicData uri="http://schemas.openxmlformats.org/drawingml/2006/picture">
                       <pic:pic>
                         <pic:nvPicPr>
-                          <pic:cNvPr descr="C:\Program Files\Quarto\share\formats\docx\note.png" id="78" name="Picture"/>
+                          <pic:cNvPr descr="C:\Program Files\Quarto\share\formats\docx\note.png" id="79" name="Picture"/>
                           <pic:cNvPicPr>
                             <a:picLocks noChangeArrowheads="1" noChangeAspect="1"/>
                           </pic:cNvPicPr>
                         </pic:nvPicPr>
                         <pic:blipFill>
-                          <a:blip r:embed="rId18"/>
+                          <a:blip r:embed="rId19"/>
                           <a:stretch>
                             <a:fillRect/>
                           </a:stretch>
@@ -18499,7 +18767,7 @@
       <w:tr>
         <w:tc>
           <w:tcPr/>
-          <w:bookmarkStart w:id="79" w:name="tbl-max-safe-volume"/>
+          <w:bookmarkStart w:id="80" w:name="tbl-max-safe-volume"/>
           <w:p>
             <w:pPr>
               <w:jc w:val="center"/>
@@ -18995,13 +19263,13 @@
               </w:tc>
             </w:tr>
           </w:tbl>
-          <w:bookmarkEnd w:id="79"/>
+          <w:bookmarkEnd w:id="80"/>
           <w:p/>
         </w:tc>
       </w:tr>
     </w:tbl>
-    <w:bookmarkEnd w:id="80"/>
-    <w:bookmarkStart w:id="81" w:name="sec-validity-conditions"/>
+    <w:bookmarkEnd w:id="81"/>
+    <w:bookmarkStart w:id="82" w:name="sec-validity-conditions"/>
     <w:p>
       <w:pPr>
         <w:pStyle w:val="Heading2"/>
@@ -19112,9 +19380,9 @@
         <w:t xml:space="preserve">The weakest assumption is bag integrity over the full shipping duration. If the foil laminate develops a pinhole or seal defect, the bag can lose gas slowly even without a vent valve. That scenario converges toward the original failure mechanism at a rate set by the leak conductance. Bag integrity verification (helium leak testing or equivalent) therefore becomes the primary qualification requirement if the vent is removed.</w:t>
       </w:r>
     </w:p>
-    <w:bookmarkEnd w:id="81"/>
     <w:bookmarkEnd w:id="82"/>
-    <w:bookmarkStart w:id="83" w:name="sec-not-bag-leakage"/>
+    <w:bookmarkEnd w:id="83"/>
+    <w:bookmarkStart w:id="84" w:name="sec-not-bag-leakage"/>
     <w:p>
       <w:pPr>
         <w:pStyle w:val="Heading1"/>
@@ -19214,8 +19482,8 @@
         <w:t xml:space="preserve">.</w:t>
       </w:r>
     </w:p>
-    <w:bookmarkEnd w:id="83"/>
-    <w:bookmarkStart w:id="84" w:name="sec-review-assumptions"/>
+    <w:bookmarkEnd w:id="84"/>
+    <w:bookmarkStart w:id="85" w:name="sec-review-assumptions"/>
     <w:p>
       <w:pPr>
         <w:pStyle w:val="Heading1"/>
@@ -19413,8 +19681,8 @@
         <w:t xml:space="preserve">for multi-leg and handling implications.</w:t>
       </w:r>
     </w:p>
-    <w:bookmarkEnd w:id="84"/>
-    <w:bookmarkStart w:id="99" w:name="sec-findings"/>
+    <w:bookmarkEnd w:id="85"/>
+    <w:bookmarkStart w:id="100" w:name="sec-findings"/>
     <w:p>
       <w:pPr>
         <w:pStyle w:val="Heading1"/>
@@ -19423,7 +19691,7 @@
         <w:t xml:space="preserve">13. Findings</w:t>
       </w:r>
     </w:p>
-    <w:bookmarkStart w:id="85" w:name="fnd-sh-001"/>
+    <w:bookmarkStart w:id="86" w:name="fnd-sh-001"/>
     <w:p>
       <w:pPr>
         <w:pStyle w:val="FirstParagraph"/>
@@ -19495,8 +19763,8 @@
         <w:t xml:space="preserve">).</w:t>
       </w:r>
     </w:p>
-    <w:bookmarkEnd w:id="85"/>
-    <w:bookmarkStart w:id="86" w:name="fnd-sh-002"/>
+    <w:bookmarkEnd w:id="86"/>
+    <w:bookmarkStart w:id="87" w:name="fnd-sh-002"/>
     <w:p>
       <w:pPr>
         <w:pStyle w:val="BodyText"/>
@@ -19582,8 +19850,8 @@
         <w:t xml:space="preserve">).</w:t>
       </w:r>
     </w:p>
-    <w:bookmarkEnd w:id="86"/>
-    <w:bookmarkStart w:id="87" w:name="fnd-sh-003"/>
+    <w:bookmarkEnd w:id="87"/>
+    <w:bookmarkStart w:id="88" w:name="fnd-sh-003"/>
     <w:p>
       <w:pPr>
         <w:pStyle w:val="BodyText"/>
@@ -19690,8 +19958,8 @@
         <w:t xml:space="preserve">).</w:t>
       </w:r>
     </w:p>
-    <w:bookmarkEnd w:id="87"/>
-    <w:bookmarkStart w:id="88" w:name="fnd-sh-004"/>
+    <w:bookmarkEnd w:id="88"/>
+    <w:bookmarkStart w:id="89" w:name="fnd-sh-004"/>
     <w:p>
       <w:pPr>
         <w:pStyle w:val="BodyText"/>
@@ -19780,8 +20048,8 @@
         <w:t xml:space="preserve">).</w:t>
       </w:r>
     </w:p>
-    <w:bookmarkEnd w:id="88"/>
-    <w:bookmarkStart w:id="89" w:name="fnd-sh-005"/>
+    <w:bookmarkEnd w:id="89"/>
+    <w:bookmarkStart w:id="90" w:name="fnd-sh-005"/>
     <w:p>
       <w:pPr>
         <w:pStyle w:val="BodyText"/>
@@ -19877,8 +20145,8 @@
         <w:t xml:space="preserve">).</w:t>
       </w:r>
     </w:p>
-    <w:bookmarkEnd w:id="89"/>
-    <w:bookmarkStart w:id="90" w:name="fnd-sh-006"/>
+    <w:bookmarkEnd w:id="90"/>
+    <w:bookmarkStart w:id="91" w:name="fnd-sh-006"/>
     <w:p>
       <w:pPr>
         <w:pStyle w:val="BodyText"/>
@@ -19926,8 +20194,8 @@
         <w:t xml:space="preserve">); citation pending.</w:t>
       </w:r>
     </w:p>
-    <w:bookmarkEnd w:id="90"/>
-    <w:bookmarkStart w:id="91" w:name="fnd-sh-007"/>
+    <w:bookmarkEnd w:id="91"/>
+    <w:bookmarkStart w:id="92" w:name="fnd-sh-007"/>
     <w:p>
       <w:pPr>
         <w:pStyle w:val="BodyText"/>
@@ -20042,8 +20310,8 @@
         <w:t xml:space="preserve">); limited to the 2 psig valve case.</w:t>
       </w:r>
     </w:p>
-    <w:bookmarkEnd w:id="91"/>
-    <w:bookmarkStart w:id="92" w:name="fnd-sh-008"/>
+    <w:bookmarkEnd w:id="92"/>
+    <w:bookmarkStart w:id="93" w:name="fnd-sh-008"/>
     <w:p>
       <w:pPr>
         <w:pStyle w:val="BodyText"/>
@@ -20103,8 +20371,8 @@
         <w:t xml:space="preserve">Disposition: derived finding; supported by model results and manufacturer specification.</w:t>
       </w:r>
     </w:p>
-    <w:bookmarkEnd w:id="92"/>
-    <w:bookmarkStart w:id="93" w:name="fnd-sh-009"/>
+    <w:bookmarkEnd w:id="93"/>
+    <w:bookmarkStart w:id="94" w:name="fnd-sh-009"/>
     <w:p>
       <w:pPr>
         <w:pStyle w:val="BodyText"/>
@@ -20135,8 +20403,8 @@
         <w:t xml:space="preserve">Disposition: operational fact; confirmed by shipping logistics.</w:t>
       </w:r>
     </w:p>
-    <w:bookmarkEnd w:id="93"/>
-    <w:bookmarkStart w:id="94" w:name="fnd-sh-010"/>
+    <w:bookmarkEnd w:id="94"/>
+    <w:bookmarkStart w:id="95" w:name="fnd-sh-010"/>
     <w:p>
       <w:pPr>
         <w:pStyle w:val="BodyText"/>
@@ -20167,8 +20435,8 @@
         <w:t xml:space="preserve">Disposition: acknowledged model limitation.</w:t>
       </w:r>
     </w:p>
-    <w:bookmarkEnd w:id="94"/>
-    <w:bookmarkStart w:id="95" w:name="fnd-sh-011"/>
+    <w:bookmarkEnd w:id="95"/>
+    <w:bookmarkStart w:id="96" w:name="fnd-sh-011"/>
     <w:p>
       <w:pPr>
         <w:pStyle w:val="BodyText"/>
@@ -20199,8 +20467,8 @@
         <w:t xml:space="preserve">Disposition: physical observation; not captured in the quasi-static model.</w:t>
       </w:r>
     </w:p>
-    <w:bookmarkEnd w:id="95"/>
-    <w:bookmarkStart w:id="96" w:name="fnd-sh-012"/>
+    <w:bookmarkEnd w:id="96"/>
+    <w:bookmarkStart w:id="97" w:name="fnd-sh-012"/>
     <w:p>
       <w:pPr>
         <w:pStyle w:val="BodyText"/>
@@ -20259,8 +20527,8 @@
         <w:t xml:space="preserve">).</w:t>
       </w:r>
     </w:p>
-    <w:bookmarkEnd w:id="96"/>
-    <w:bookmarkStart w:id="97" w:name="fnd-sh-013"/>
+    <w:bookmarkEnd w:id="97"/>
+    <w:bookmarkStart w:id="98" w:name="fnd-sh-013"/>
     <w:p>
       <w:pPr>
         <w:pStyle w:val="BodyText"/>
@@ -20308,8 +20576,8 @@
         <w:t xml:space="preserve">).</w:t>
       </w:r>
     </w:p>
-    <w:bookmarkEnd w:id="97"/>
-    <w:bookmarkStart w:id="98" w:name="fnd-sh-014"/>
+    <w:bookmarkEnd w:id="98"/>
+    <w:bookmarkStart w:id="99" w:name="fnd-sh-014"/>
     <w:p>
       <w:pPr>
         <w:pStyle w:val="BodyText"/>
@@ -20390,9 +20658,9 @@
         <w:t xml:space="preserve">).</w:t>
       </w:r>
     </w:p>
-    <w:bookmarkEnd w:id="98"/>
     <w:bookmarkEnd w:id="99"/>
-    <w:bookmarkStart w:id="100" w:name="sec-critical-unknowns"/>
+    <w:bookmarkEnd w:id="100"/>
+    <w:bookmarkStart w:id="101" w:name="sec-critical-unknowns"/>
     <w:p>
       <w:pPr>
         <w:pStyle w:val="Heading1"/>
@@ -20525,8 +20793,8 @@
         <w:t xml:space="preserve">A direct volume measurement (CAD roll-up, gas-fill/water displacement, or equivalent traceable method).</w:t>
       </w:r>
     </w:p>
-    <w:bookmarkEnd w:id="100"/>
-    <w:bookmarkStart w:id="103" w:name="sec-closure"/>
+    <w:bookmarkEnd w:id="101"/>
+    <w:bookmarkStart w:id="104" w:name="sec-closure"/>
     <w:p>
       <w:pPr>
         <w:pStyle w:val="Heading1"/>
@@ -21076,6 +21344,79 @@
           </w:p>
         </w:tc>
       </w:tr>
+      <w:tr>
+        <w:tc>
+          <w:tcPr/>
+          <w:p>
+            <w:pPr>
+              <w:pStyle w:val="Compact"/>
+              <w:jc w:val="left"/>
+            </w:pPr>
+            <w:r>
+              <w:t xml:space="preserve">Multi-leg underpressure analysis</w:t>
+            </w:r>
+          </w:p>
+        </w:tc>
+        <w:tc>
+          <w:tcPr/>
+          <w:p>
+            <w:pPr>
+              <w:pStyle w:val="Compact"/>
+              <w:jc w:val="left"/>
+            </w:pPr>
+            <w:r>
+              <w:t xml:space="preserve">TBD</w:t>
+            </w:r>
+          </w:p>
+        </w:tc>
+        <w:tc>
+          <w:tcPr/>
+          <w:p>
+            <w:pPr>
+              <w:pStyle w:val="Compact"/>
+              <w:jc w:val="left"/>
+            </w:pPr>
+            <w:r>
+              <w:t xml:space="preserve">Determines whether the vent-removal recommendation extends to multi-leg shipments. The single-flight model does not cover the valve-stuck-open scenario on leg 2+ (</w:t>
+            </w:r>
+            <w:r>
+              <w:rPr>
+                <w:b/>
+                <w:bCs/>
+              </w:rPr>
+              <w:t xml:space="preserve">FND-SH-008</w:t>
+            </w:r>
+            <w:r>
+              <w:t xml:space="preserve">,</w:t>
+            </w:r>
+            <w:r>
+              <w:t xml:space="preserve"> </w:t>
+            </w:r>
+            <w:r>
+              <w:rPr>
+                <w:b/>
+                <w:bCs/>
+              </w:rPr>
+              <w:t xml:space="preserve">FND-SH-009</w:t>
+            </w:r>
+            <w:r>
+              <w:t xml:space="preserve">).</w:t>
+            </w:r>
+          </w:p>
+        </w:tc>
+        <w:tc>
+          <w:tcPr/>
+          <w:p>
+            <w:pPr>
+              <w:pStyle w:val="Compact"/>
+              <w:jc w:val="left"/>
+            </w:pPr>
+            <w:r>
+              <w:t xml:space="preserve">Not started; recommendation currently scoped to single flight cycle</w:t>
+            </w:r>
+          </w:p>
+        </w:tc>
+      </w:tr>
     </w:tbl>
     <w:p>
       <w:pPr>
@@ -21126,18 +21467,18 @@
                 <wp:inline>
                   <wp:extent cx="152400" cy="152400"/>
                   <wp:effectExtent b="0" l="0" r="0" t="0"/>
-                  <wp:docPr descr="" title="" id="101" name="Picture"/>
+                  <wp:docPr descr="" title="" id="102" name="Picture"/>
                   <a:graphic>
                     <a:graphicData uri="http://schemas.openxmlformats.org/drawingml/2006/picture">
                       <pic:pic>
                         <pic:nvPicPr>
-                          <pic:cNvPr descr="C:\Program Files\Quarto\share\formats\docx\important.png" id="102" name="Picture"/>
+                          <pic:cNvPr descr="C:\Program Files\Quarto\share\formats\docx\important.png" id="103" name="Picture"/>
                           <pic:cNvPicPr>
                             <a:picLocks noChangeArrowheads="1" noChangeAspect="1"/>
                           </pic:cNvPicPr>
                         </pic:nvPicPr>
                         <pic:blipFill>
-                          <a:blip r:embed="rId22"/>
+                          <a:blip r:embed="rId23"/>
                           <a:stretch>
                             <a:fillRect/>
                           </a:stretch>
@@ -21493,8 +21834,8 @@
         </w:tc>
       </w:tr>
     </w:tbl>
-    <w:bookmarkEnd w:id="103"/>
-    <w:bookmarkStart w:id="104" w:name="sec-decision-status"/>
+    <w:bookmarkEnd w:id="104"/>
+    <w:bookmarkStart w:id="108" w:name="sec-decision-status"/>
     <w:p>
       <w:pPr>
         <w:pStyle w:val="Heading1"/>
@@ -21661,6 +22002,179 @@
         <w:t xml:space="preserve">, bag integrity if the vent is removed, and relief calibration).</w:t>
       </w:r>
     </w:p>
+    <w:tbl>
+      <w:tblPr>
+        <w:tblStyle w:val="Table"/>
+        <w:tblLook w:firstRow="0" w:lastRow="0" w:firstColumn="0" w:lastColumn="0" w:noHBand="0" w:noVBand="0" w:val="0000"/>
+        <w:tblBorders>
+          <w:top w:val="single" w:sz="4" w:space="0" w:color="EB9113"/>
+          <w:left w:val="single" w:sz="24" w:space="0" w:color="EB9113"/>
+          <w:bottom w:val="single" w:sz="4" w:space="0" w:color="EB9113"/>
+          <w:right w:val="single" w:sz="4" w:space="0" w:color="EB9113"/>
+        </w:tblBorders>
+        <w:tblCellMar>
+          <w:left w:w="144" w:type="dxa"/>
+          <w:right w:w="144" w:type="dxa"/>
+        </w:tblCellMar>
+        <w:tblLook w:firstRow="0" w:lastRow="0" w:firstColumn="0" w:lastColumn="0" w:noHBand="0" w:noVBand="0" w:val="0000"/>
+      </w:tblPr>
+      <w:tr>
+        <w:trPr>
+          <w:cantSplit/>
+        </w:trPr>
+        <w:tc>
+          <w:tcPr>
+            <w:shd w:color="auto" w:fill="fcefdc" w:val="clear"/>
+            <w:tcMar>
+              <w:top w:w="92" w:type="dxa"/>
+              <w:bottom w:w="92" w:type="dxa"/>
+            </w:tcMar>
+          </w:tcPr>
+          <w:p>
+            <w:pPr>
+              <w:pStyle w:val="BodyText"/>
+            </w:pPr>
+            <w:pPr>
+              <w:spacing w:before="0" w:after="0"/>
+              <w:textAlignment w:val="center"/>
+            </w:pPr>
+            <w:r>
+              <w:drawing>
+                <wp:inline>
+                  <wp:extent cx="152400" cy="152400"/>
+                  <wp:effectExtent b="0" l="0" r="0" t="0"/>
+                  <wp:docPr descr="" title="" id="106" name="Picture"/>
+                  <a:graphic>
+                    <a:graphicData uri="http://schemas.openxmlformats.org/drawingml/2006/picture">
+                      <pic:pic>
+                        <pic:nvPicPr>
+                          <pic:cNvPr descr="C:\Program Files\Quarto\share\formats\docx\warning.png" id="107" name="Picture"/>
+                          <pic:cNvPicPr>
+                            <a:picLocks noChangeArrowheads="1" noChangeAspect="1"/>
+                          </pic:cNvPicPr>
+                        </pic:nvPicPr>
+                        <pic:blipFill>
+                          <a:blip r:embed="rId105"/>
+                          <a:stretch>
+                            <a:fillRect/>
+                          </a:stretch>
+                        </pic:blipFill>
+                        <pic:spPr bwMode="auto">
+                          <a:xfrm>
+                            <a:off x="0" y="0"/>
+                            <a:ext cx="152400" cy="152400"/>
+                          </a:xfrm>
+                          <a:prstGeom prst="rect">
+                            <a:avLst/>
+                          </a:prstGeom>
+                          <a:noFill/>
+                          <a:ln w="9525">
+                            <a:noFill/>
+                            <a:headEnd/>
+                            <a:tailEnd/>
+                          </a:ln>
+                        </pic:spPr>
+                      </pic:pic>
+                    </a:graphicData>
+                  </a:graphic>
+                </wp:inline>
+              </w:drawing>
+            </w:r>
+            <w:r>
+              <w:t xml:space="preserve"> </w:t>
+            </w:r>
+            <w:r>
+              <w:t xml:space="preserve"> </w:t>
+            </w:r>
+            <w:r>
+              <w:t xml:space="preserve">Multi-leg scope limitation</w:t>
+            </w:r>
+          </w:p>
+        </w:tc>
+      </w:tr>
+      <w:tr>
+        <w:trPr>
+          <w:cantSplit/>
+        </w:trPr>
+        <w:tc>
+          <w:tcPr>
+            <w:tcMar>
+              <w:top w:w="108" w:type="dxa"/>
+              <w:bottom w:w="108" w:type="dxa"/>
+            </w:tcMar>
+          </w:tcPr>
+          <w:p>
+            <w:pPr>
+              <w:pStyle w:val="BodyText"/>
+            </w:pPr>
+            <w:pPr>
+              <w:spacing w:before="16" w:after="16"/>
+            </w:pPr>
+            <w:r>
+              <w:t xml:space="preserve">The single-flight model and parametric sweep support the vent-removal recommendation for a single flight cycle. Multi-leg shipments introduce two mechanisms not captured by the model: (1) the as-built valve does not reseat after first cracking (</w:t>
+            </w:r>
+            <w:r>
+              <w:rPr>
+                <w:b/>
+                <w:bCs/>
+              </w:rPr>
+              <w:t xml:space="preserve">FND-SH-008</w:t>
+            </w:r>
+            <w:r>
+              <w:t xml:space="preserve">), creating a direct open path for bidirectional gas exchange on subsequent legs; and (2) cumulative mass loss across legs exceeds the single-leg prediction (</w:t>
+            </w:r>
+            <w:r>
+              <w:rPr>
+                <w:b/>
+                <w:bCs/>
+              </w:rPr>
+              <w:t xml:space="preserve">FND-SH-009</w:t>
+            </w:r>
+            <w:r>
+              <w:t xml:space="preserve">,</w:t>
+            </w:r>
+            <w:r>
+              <w:t xml:space="preserve"> </w:t>
+            </w:r>
+            <w:r>
+              <w:rPr>
+                <w:b/>
+                <w:bCs/>
+              </w:rPr>
+              <w:t xml:space="preserve">FND-SH-010</w:t>
+            </w:r>
+            <w:r>
+              <w:t xml:space="preserve">). With the vent removed, multi-leg overpressure remains bounded per-leg by the PED relief (</w:t>
+            </w:r>
+            <w:r>
+              <w:rPr>
+                <w:b/>
+                <w:bCs/>
+              </w:rPr>
+              <w:t xml:space="preserve">FND-SH-012</w:t>
+            </w:r>
+            <w:r>
+              <w:t xml:space="preserve">), but the underpressure analysis applies only to a single flight cycle. Formal extension to multi-leg operations requires a multi-leg valve-state model or explicit restriction to single-leg shipments. See</w:t>
+            </w:r>
+            <w:r>
+              <w:t xml:space="preserve"> </w:t>
+            </w:r>
+            <w:hyperlink w:anchor="sec-closure">
+              <w:r>
+                <w:rPr>
+                  <w:rStyle w:val="Hyperlink"/>
+                </w:rPr>
+                <w:t xml:space="preserve">Section 15</w:t>
+              </w:r>
+            </w:hyperlink>
+            <w:r>
+              <w:t xml:space="preserve">.</w:t>
+            </w:r>
+          </w:p>
+          <w:p/>
+        </w:tc>
+      </w:tr>
+    </w:tbl>
     <w:p>
       <w:pPr>
         <w:pStyle w:val="BodyText"/>
@@ -21710,8 +22224,8 @@
         <w:t xml:space="preserve">35 L is consistent with both the vent-removal recommendation (safe at any volume under PED relief) and the legacy vented disposition (below the 102.11 L threshold for the as-built 2 psig valve). Traceable measurement remains required for formal closure but does not alter the recommendation direction.</w:t>
       </w:r>
     </w:p>
-    <w:bookmarkEnd w:id="104"/>
-    <w:bookmarkStart w:id="105" w:name="sec-evidence-sources"/>
+    <w:bookmarkEnd w:id="108"/>
+    <w:bookmarkStart w:id="109" w:name="sec-evidence-sources"/>
     <w:p>
       <w:pPr>
         <w:pStyle w:val="Heading1"/>
@@ -22045,8 +22559,8 @@
         </w:tc>
       </w:tr>
     </w:tbl>
-    <w:bookmarkEnd w:id="105"/>
-    <w:bookmarkStart w:id="106" w:name="sec-conclusions"/>
+    <w:bookmarkEnd w:id="109"/>
+    <w:bookmarkStart w:id="115" w:name="sec-conclusions"/>
     <w:p>
       <w:pPr>
         <w:pStyle w:val="Heading1"/>
@@ -22470,7 +22984,166 @@
         <w:t xml:space="preserve">.</w:t>
       </w:r>
     </w:p>
-    <w:bookmarkEnd w:id="106"/>
+    <w:bookmarkStart w:id="114" w:name="refs"/>
+    <w:bookmarkStart w:id="110" w:name="ref-ped_2014_68_eu"/>
+    <w:p>
+      <w:pPr>
+        <w:pStyle w:val="Bibliography"/>
+      </w:pPr>
+      <w:r>
+        <w:t xml:space="preserve">[1]</w:t>
+      </w:r>
+      <w:r>
+        <w:t xml:space="preserve"> </w:t>
+      </w:r>
+      <w:r>
+        <w:t xml:space="preserve">	</w:t>
+      </w:r>
+      <w:r>
+        <w:t xml:space="preserve">European Parliament and Council,</w:t>
+      </w:r>
+      <w:r>
+        <w:t xml:space="preserve"> </w:t>
+      </w:r>
+      <w:r>
+        <w:t xml:space="preserve">“Directive 2014/68/</w:t>
+      </w:r>
+      <w:r>
+        <w:t xml:space="preserve">EU</w:t>
+      </w:r>
+      <w:r>
+        <w:t xml:space="preserve"> </w:t>
+      </w:r>
+      <w:r>
+        <w:t xml:space="preserve">– pressure equipment.”</w:t>
+      </w:r>
+      <w:r>
+        <w:t xml:space="preserve"> </w:t>
+      </w:r>
+      <w:r>
+        <w:t xml:space="preserve">2014.</w:t>
+      </w:r>
+    </w:p>
+    <w:bookmarkEnd w:id="110"/>
+    <w:bookmarkStart w:id="111" w:name="ref-swagelok_6l_cw4vr4p"/>
+    <w:p>
+      <w:pPr>
+        <w:pStyle w:val="Bibliography"/>
+      </w:pPr>
+      <w:r>
+        <w:t xml:space="preserve">[2]</w:t>
+      </w:r>
+      <w:r>
+        <w:t xml:space="preserve"> </w:t>
+      </w:r>
+      <w:r>
+        <w:t xml:space="preserve">	</w:t>
+      </w:r>
+      <w:r>
+        <w:t xml:space="preserve">Swagelok Company,</w:t>
+      </w:r>
+      <w:r>
+        <w:t xml:space="preserve"> </w:t>
+      </w:r>
+      <w:r>
+        <w:t xml:space="preserve">“6L-CW4VR4-p high-purity welded check valve.”</w:t>
+      </w:r>
+      <w:r>
+        <w:t xml:space="preserve"> </w:t>
+      </w:r>
+      <w:r>
+        <w:t xml:space="preserve">Swagelok product datasheet, 2023.</w:t>
+      </w:r>
+    </w:p>
+    <w:bookmarkEnd w:id="111"/>
+    <w:bookmarkStart w:id="112" w:name="ref-faa_14cfr25_841"/>
+    <w:p>
+      <w:pPr>
+        <w:pStyle w:val="Bibliography"/>
+      </w:pPr>
+      <w:r>
+        <w:t xml:space="preserve">[3]</w:t>
+      </w:r>
+      <w:r>
+        <w:t xml:space="preserve"> </w:t>
+      </w:r>
+      <w:r>
+        <w:t xml:space="preserve">	</w:t>
+      </w:r>
+      <w:r>
+        <w:t xml:space="preserve">Federal Aviation Administration,</w:t>
+      </w:r>
+      <w:r>
+        <w:t xml:space="preserve"> </w:t>
+      </w:r>
+      <w:r>
+        <w:t xml:space="preserve">“14</w:t>
+      </w:r>
+      <w:r>
+        <w:t xml:space="preserve"> </w:t>
+      </w:r>
+      <w:r>
+        <w:t xml:space="preserve">CFR</w:t>
+      </w:r>
+      <w:r>
+        <w:t xml:space="preserve"> </w:t>
+      </w:r>
+      <w:r>
+        <w:t xml:space="preserve">25.841 – pressurized cabins.”</w:t>
+      </w:r>
+      <w:r>
+        <w:t xml:space="preserve"> </w:t>
+      </w:r>
+      <w:r>
+        <w:t xml:space="preserve">Code of Federal Regulations, Title 14, Part 25, 2024.</w:t>
+      </w:r>
+    </w:p>
+    <w:bookmarkEnd w:id="112"/>
+    <w:bookmarkStart w:id="113" w:name="ref-icao_std_atmosphere"/>
+    <w:p>
+      <w:pPr>
+        <w:pStyle w:val="Bibliography"/>
+      </w:pPr>
+      <w:r>
+        <w:t xml:space="preserve">[4]</w:t>
+      </w:r>
+      <w:r>
+        <w:t xml:space="preserve"> </w:t>
+      </w:r>
+      <w:r>
+        <w:t xml:space="preserve">	</w:t>
+      </w:r>
+      <w:r>
+        <w:t xml:space="preserve">International Civil Aviation Organization,</w:t>
+      </w:r>
+      <w:r>
+        <w:t xml:space="preserve"> </w:t>
+      </w:r>
+      <w:r>
+        <w:t xml:space="preserve">“Manual of the</w:t>
+      </w:r>
+      <w:r>
+        <w:t xml:space="preserve"> </w:t>
+      </w:r>
+      <w:r>
+        <w:t xml:space="preserve">ICAO</w:t>
+      </w:r>
+      <w:r>
+        <w:t xml:space="preserve"> </w:t>
+      </w:r>
+      <w:r>
+        <w:t xml:space="preserve">standard atmosphere,”</w:t>
+      </w:r>
+      <w:r>
+        <w:t xml:space="preserve"> </w:t>
+      </w:r>
+      <w:r>
+        <w:t xml:space="preserve">ICAO, Doc 7488/3, 1993.</w:t>
+      </w:r>
+    </w:p>
+    <w:bookmarkEnd w:id="113"/>
+    <w:bookmarkEnd w:id="114"/>
+    <w:bookmarkEnd w:id="115"/>
     <w:sectPr>
       <w:footnotePr>
         <w:numRestart w:val="eachSect"/>

</xml_diff>